<commit_message>
should be an addition of a box score function to every game and an nrl tab
</commit_message>
<xml_diff>
--- a/Documentation/processdiaryimagecollection.docx
+++ b/Documentation/processdiaryimagecollection.docx
@@ -23,7 +23,7 @@
                     <pic:cNvPicPr/>
                   </pic:nvPicPr>
                   <pic:blipFill>
-                    <a:blip r:embed="rId4"/>
+                    <a:blip r:embed="rId6"/>
                     <a:stretch>
                       <a:fillRect/>
                     </a:stretch>
@@ -65,7 +65,7 @@
                     <pic:cNvPicPr/>
                   </pic:nvPicPr>
                   <pic:blipFill>
-                    <a:blip r:embed="rId5"/>
+                    <a:blip r:embed="rId7"/>
                     <a:stretch>
                       <a:fillRect/>
                     </a:stretch>
@@ -114,7 +114,7 @@
                     <pic:cNvPicPr/>
                   </pic:nvPicPr>
                   <pic:blipFill>
-                    <a:blip r:embed="rId6"/>
+                    <a:blip r:embed="rId8"/>
                     <a:stretch>
                       <a:fillRect/>
                     </a:stretch>
@@ -154,7 +154,7 @@
                     <pic:cNvPicPr/>
                   </pic:nvPicPr>
                   <pic:blipFill>
-                    <a:blip r:embed="rId7"/>
+                    <a:blip r:embed="rId9"/>
                     <a:stretch>
                       <a:fillRect/>
                     </a:stretch>
@@ -204,7 +204,7 @@
                     <pic:cNvPicPr/>
                   </pic:nvPicPr>
                   <pic:blipFill>
-                    <a:blip r:embed="rId8"/>
+                    <a:blip r:embed="rId10"/>
                     <a:stretch>
                       <a:fillRect/>
                     </a:stretch>
@@ -248,7 +248,7 @@
                     <pic:cNvPicPr/>
                   </pic:nvPicPr>
                   <pic:blipFill>
-                    <a:blip r:embed="rId9"/>
+                    <a:blip r:embed="rId11"/>
                     <a:stretch>
                       <a:fillRect/>
                     </a:stretch>
@@ -298,7 +298,7 @@
                     <pic:cNvPicPr/>
                   </pic:nvPicPr>
                   <pic:blipFill>
-                    <a:blip r:embed="rId10"/>
+                    <a:blip r:embed="rId12"/>
                     <a:stretch>
                       <a:fillRect/>
                     </a:stretch>
@@ -345,7 +345,7 @@
                     <pic:cNvPicPr/>
                   </pic:nvPicPr>
                   <pic:blipFill>
-                    <a:blip r:embed="rId11"/>
+                    <a:blip r:embed="rId13"/>
                     <a:stretch>
                       <a:fillRect/>
                     </a:stretch>
@@ -366,6 +366,47 @@
         </w:drawing>
       </w:r>
     </w:p>
+    <w:p/>
+    <w:p>
+      <w:r>
+        <w:lastRenderedPageBreak/>
+        <w:drawing>
+          <wp:inline distT="0" distB="0" distL="0" distR="0" wp14:anchorId="1BE28A4B" wp14:editId="09FC9A4B">
+            <wp:extent cx="5731510" cy="6711950"/>
+            <wp:effectExtent l="0" t="0" r="2540" b="0"/>
+            <wp:docPr id="1945556363" name="Picture 1"/>
+            <wp:cNvGraphicFramePr>
+              <a:graphicFrameLocks xmlns:a="http://schemas.openxmlformats.org/drawingml/2006/main" noChangeAspect="1"/>
+            </wp:cNvGraphicFramePr>
+            <a:graphic xmlns:a="http://schemas.openxmlformats.org/drawingml/2006/main">
+              <a:graphicData uri="http://schemas.openxmlformats.org/drawingml/2006/picture">
+                <pic:pic xmlns:pic="http://schemas.openxmlformats.org/drawingml/2006/picture">
+                  <pic:nvPicPr>
+                    <pic:cNvPr id="1945556363" name=""/>
+                    <pic:cNvPicPr/>
+                  </pic:nvPicPr>
+                  <pic:blipFill>
+                    <a:blip r:embed="rId14"/>
+                    <a:stretch>
+                      <a:fillRect/>
+                    </a:stretch>
+                  </pic:blipFill>
+                  <pic:spPr>
+                    <a:xfrm>
+                      <a:off x="0" y="0"/>
+                      <a:ext cx="5731510" cy="6711950"/>
+                    </a:xfrm>
+                    <a:prstGeom prst="rect">
+                      <a:avLst/>
+                    </a:prstGeom>
+                  </pic:spPr>
+                </pic:pic>
+              </a:graphicData>
+            </a:graphic>
+          </wp:inline>
+        </w:drawing>
+      </w:r>
+    </w:p>
     <w:sectPr>
       <w:pgSz w:w="11906" w:h="16838"/>
       <w:pgMar w:top="1440" w:right="1440" w:bottom="1440" w:left="1440" w:header="708" w:footer="708" w:gutter="0"/>
@@ -374,6 +415,56 @@
     </w:sectPr>
   </w:body>
 </w:document>
+</file>
+
+<file path=word/endnotes.xml><?xml version="1.0" encoding="utf-8"?>
+<w:endnotes xmlns:wpc="http://schemas.microsoft.com/office/word/2010/wordprocessingCanvas" xmlns:cx="http://schemas.microsoft.com/office/drawing/2014/chartex" xmlns:cx1="http://schemas.microsoft.com/office/drawing/2015/9/8/chartex" xmlns:cx2="http://schemas.microsoft.com/office/drawing/2015/10/21/chartex" xmlns:cx3="http://schemas.microsoft.com/office/drawing/2016/5/9/chartex" xmlns:cx4="http://schemas.microsoft.com/office/drawing/2016/5/10/chartex" xmlns:cx5="http://schemas.microsoft.com/office/drawing/2016/5/11/chartex" xmlns:cx6="http://schemas.microsoft.com/office/drawing/2016/5/12/chartex" xmlns:cx7="http://schemas.microsoft.com/office/drawing/2016/5/13/chartex" xmlns:cx8="http://schemas.microsoft.com/office/drawing/2016/5/14/chartex" xmlns:mc="http://schemas.openxmlformats.org/markup-compatibility/2006" xmlns:aink="http://schemas.microsoft.com/office/drawing/2016/ink" xmlns:am3d="http://schemas.microsoft.com/office/drawing/2017/model3d" xmlns:o="urn:schemas-microsoft-com:office:office" xmlns:oel="http://schemas.microsoft.com/office/2019/extlst" xmlns:r="http://schemas.openxmlformats.org/officeDocument/2006/relationships" xmlns:m="http://schemas.openxmlformats.org/officeDocument/2006/math" xmlns:v="urn:schemas-microsoft-com:vml" xmlns:wp14="http://schemas.microsoft.com/office/word/2010/wordprocessingDrawing" xmlns:wp="http://schemas.openxmlformats.org/drawingml/2006/wordprocessingDrawing" xmlns:w10="urn:schemas-microsoft-com:office:word" xmlns:w="http://schemas.openxmlformats.org/wordprocessingml/2006/main" xmlns:w14="http://schemas.microsoft.com/office/word/2010/wordml" xmlns:w15="http://schemas.microsoft.com/office/word/2012/wordml" xmlns:w16cex="http://schemas.microsoft.com/office/word/2018/wordml/cex" xmlns:w16cid="http://schemas.microsoft.com/office/word/2016/wordml/cid" xmlns:w16="http://schemas.microsoft.com/office/word/2018/wordml" xmlns:w16du="http://schemas.microsoft.com/office/word/2023/wordml/word16du" xmlns:w16sdtdh="http://schemas.microsoft.com/office/word/2020/wordml/sdtdatahash" xmlns:w16sdtfl="http://schemas.microsoft.com/office/word/2024/wordml/sdtformatlock" xmlns:w16se="http://schemas.microsoft.com/office/word/2015/wordml/symex" xmlns:wpg="http://schemas.microsoft.com/office/word/2010/wordprocessingGroup" xmlns:wpi="http://schemas.microsoft.com/office/word/2010/wordprocessingInk" xmlns:wne="http://schemas.microsoft.com/office/word/2006/wordml" xmlns:wps="http://schemas.microsoft.com/office/word/2010/wordprocessingShape" mc:Ignorable="w14 w15 w16se w16cid w16 w16cex w16sdtdh w16sdtfl w16du wp14">
+  <w:endnote w:type="separator" w:id="-1">
+    <w:p>
+      <w:pPr>
+        <w:spacing w:after="0" w:line="240" w:lineRule="auto"/>
+      </w:pPr>
+      <w:r>
+        <w:separator/>
+      </w:r>
+    </w:p>
+  </w:endnote>
+  <w:endnote w:type="continuationSeparator" w:id="0">
+    <w:p>
+      <w:pPr>
+        <w:spacing w:after="0" w:line="240" w:lineRule="auto"/>
+      </w:pPr>
+      <w:r>
+        <w:continuationSeparator/>
+      </w:r>
+    </w:p>
+  </w:endnote>
+</w:endnotes>
+</file>
+
+<file path=word/footnotes.xml><?xml version="1.0" encoding="utf-8"?>
+<w:footnotes xmlns:wpc="http://schemas.microsoft.com/office/word/2010/wordprocessingCanvas" xmlns:cx="http://schemas.microsoft.com/office/drawing/2014/chartex" xmlns:cx1="http://schemas.microsoft.com/office/drawing/2015/9/8/chartex" xmlns:cx2="http://schemas.microsoft.com/office/drawing/2015/10/21/chartex" xmlns:cx3="http://schemas.microsoft.com/office/drawing/2016/5/9/chartex" xmlns:cx4="http://schemas.microsoft.com/office/drawing/2016/5/10/chartex" xmlns:cx5="http://schemas.microsoft.com/office/drawing/2016/5/11/chartex" xmlns:cx6="http://schemas.microsoft.com/office/drawing/2016/5/12/chartex" xmlns:cx7="http://schemas.microsoft.com/office/drawing/2016/5/13/chartex" xmlns:cx8="http://schemas.microsoft.com/office/drawing/2016/5/14/chartex" xmlns:mc="http://schemas.openxmlformats.org/markup-compatibility/2006" xmlns:aink="http://schemas.microsoft.com/office/drawing/2016/ink" xmlns:am3d="http://schemas.microsoft.com/office/drawing/2017/model3d" xmlns:o="urn:schemas-microsoft-com:office:office" xmlns:oel="http://schemas.microsoft.com/office/2019/extlst" xmlns:r="http://schemas.openxmlformats.org/officeDocument/2006/relationships" xmlns:m="http://schemas.openxmlformats.org/officeDocument/2006/math" xmlns:v="urn:schemas-microsoft-com:vml" xmlns:wp14="http://schemas.microsoft.com/office/word/2010/wordprocessingDrawing" xmlns:wp="http://schemas.openxmlformats.org/drawingml/2006/wordprocessingDrawing" xmlns:w10="urn:schemas-microsoft-com:office:word" xmlns:w="http://schemas.openxmlformats.org/wordprocessingml/2006/main" xmlns:w14="http://schemas.microsoft.com/office/word/2010/wordml" xmlns:w15="http://schemas.microsoft.com/office/word/2012/wordml" xmlns:w16cex="http://schemas.microsoft.com/office/word/2018/wordml/cex" xmlns:w16cid="http://schemas.microsoft.com/office/word/2016/wordml/cid" xmlns:w16="http://schemas.microsoft.com/office/word/2018/wordml" xmlns:w16du="http://schemas.microsoft.com/office/word/2023/wordml/word16du" xmlns:w16sdtdh="http://schemas.microsoft.com/office/word/2020/wordml/sdtdatahash" xmlns:w16sdtfl="http://schemas.microsoft.com/office/word/2024/wordml/sdtformatlock" xmlns:w16se="http://schemas.microsoft.com/office/word/2015/wordml/symex" xmlns:wpg="http://schemas.microsoft.com/office/word/2010/wordprocessingGroup" xmlns:wpi="http://schemas.microsoft.com/office/word/2010/wordprocessingInk" xmlns:wne="http://schemas.microsoft.com/office/word/2006/wordml" xmlns:wps="http://schemas.microsoft.com/office/word/2010/wordprocessingShape" mc:Ignorable="w14 w15 w16se w16cid w16 w16cex w16sdtdh w16sdtfl w16du wp14">
+  <w:footnote w:type="separator" w:id="-1">
+    <w:p>
+      <w:pPr>
+        <w:spacing w:after="0" w:line="240" w:lineRule="auto"/>
+      </w:pPr>
+      <w:r>
+        <w:separator/>
+      </w:r>
+    </w:p>
+  </w:footnote>
+  <w:footnote w:type="continuationSeparator" w:id="0">
+    <w:p>
+      <w:pPr>
+        <w:spacing w:after="0" w:line="240" w:lineRule="auto"/>
+      </w:pPr>
+      <w:r>
+        <w:continuationSeparator/>
+      </w:r>
+    </w:p>
+  </w:footnote>
+</w:footnotes>
 </file>
 
 <file path=word/styles.xml><?xml version="1.0" encoding="utf-8"?>
@@ -1293,6 +1384,50 @@
       <w:spacing w:val="5"/>
     </w:rPr>
   </w:style>
+  <w:style w:type="paragraph" w:styleId="Header">
+    <w:name w:val="header"/>
+    <w:basedOn w:val="Normal"/>
+    <w:link w:val="HeaderChar"/>
+    <w:uiPriority w:val="99"/>
+    <w:unhideWhenUsed/>
+    <w:rsid w:val="000B402D"/>
+    <w:pPr>
+      <w:tabs>
+        <w:tab w:val="center" w:pos="4513"/>
+        <w:tab w:val="right" w:pos="9026"/>
+      </w:tabs>
+      <w:spacing w:after="0" w:line="240" w:lineRule="auto"/>
+    </w:pPr>
+  </w:style>
+  <w:style w:type="character" w:customStyle="1" w:styleId="HeaderChar">
+    <w:name w:val="Header Char"/>
+    <w:basedOn w:val="DefaultParagraphFont"/>
+    <w:link w:val="Header"/>
+    <w:uiPriority w:val="99"/>
+    <w:rsid w:val="000B402D"/>
+  </w:style>
+  <w:style w:type="paragraph" w:styleId="Footer">
+    <w:name w:val="footer"/>
+    <w:basedOn w:val="Normal"/>
+    <w:link w:val="FooterChar"/>
+    <w:uiPriority w:val="99"/>
+    <w:unhideWhenUsed/>
+    <w:rsid w:val="000B402D"/>
+    <w:pPr>
+      <w:tabs>
+        <w:tab w:val="center" w:pos="4513"/>
+        <w:tab w:val="right" w:pos="9026"/>
+      </w:tabs>
+      <w:spacing w:after="0" w:line="240" w:lineRule="auto"/>
+    </w:pPr>
+  </w:style>
+  <w:style w:type="character" w:customStyle="1" w:styleId="FooterChar">
+    <w:name w:val="Footer Char"/>
+    <w:basedOn w:val="DefaultParagraphFont"/>
+    <w:link w:val="Footer"/>
+    <w:uiPriority w:val="99"/>
+    <w:rsid w:val="000B402D"/>
+  </w:style>
 </w:styles>
 </file>
 

</xml_diff>

<commit_message>
Cleaned up code, fixed hard writing my api key into the code, updated some wrong stats
</commit_message>
<xml_diff>
--- a/Documentation/processdiaryimagecollection.docx
+++ b/Documentation/processdiaryimagecollection.docx
@@ -329,6 +329,9 @@
     </w:p>
     <w:p>
       <w:r>
+        <w:rPr>
+          <w:noProof/>
+        </w:rPr>
         <w:drawing>
           <wp:inline distT="0" distB="0" distL="0" distR="0" wp14:anchorId="2EFC83FB" wp14:editId="5A17FBD1">
             <wp:extent cx="5731510" cy="2842895"/>
@@ -368,7 +371,15 @@
     </w:p>
     <w:p/>
     <w:p>
+      <w:pPr>
+        <w:rPr>
+          <w:noProof/>
+        </w:rPr>
+      </w:pPr>
       <w:r>
+        <w:rPr>
+          <w:noProof/>
+        </w:rPr>
         <w:lastRenderedPageBreak/>
         <w:drawing>
           <wp:inline distT="0" distB="0" distL="0" distR="0" wp14:anchorId="1BE28A4B" wp14:editId="09FC9A4B">
@@ -395,6 +406,99 @@
                     <a:xfrm>
                       <a:off x="0" y="0"/>
                       <a:ext cx="5731510" cy="6711950"/>
+                    </a:xfrm>
+                    <a:prstGeom prst="rect">
+                      <a:avLst/>
+                    </a:prstGeom>
+                  </pic:spPr>
+                </pic:pic>
+              </a:graphicData>
+            </a:graphic>
+          </wp:inline>
+        </w:drawing>
+      </w:r>
+    </w:p>
+    <w:p/>
+    <w:p/>
+    <w:p>
+      <w:pPr>
+        <w:rPr>
+          <w:noProof/>
+        </w:rPr>
+      </w:pPr>
+    </w:p>
+    <w:p>
+      <w:r>
+        <w:rPr>
+          <w:noProof/>
+        </w:rPr>
+        <w:lastRenderedPageBreak/>
+        <w:drawing>
+          <wp:inline distT="0" distB="0" distL="0" distR="0" wp14:anchorId="36206C9C" wp14:editId="4DFF3253">
+            <wp:extent cx="5731510" cy="4617720"/>
+            <wp:effectExtent l="0" t="0" r="2540" b="0"/>
+            <wp:docPr id="1872433678" name="Picture 1"/>
+            <wp:cNvGraphicFramePr>
+              <a:graphicFrameLocks xmlns:a="http://schemas.openxmlformats.org/drawingml/2006/main" noChangeAspect="1"/>
+            </wp:cNvGraphicFramePr>
+            <a:graphic xmlns:a="http://schemas.openxmlformats.org/drawingml/2006/main">
+              <a:graphicData uri="http://schemas.openxmlformats.org/drawingml/2006/picture">
+                <pic:pic xmlns:pic="http://schemas.openxmlformats.org/drawingml/2006/picture">
+                  <pic:nvPicPr>
+                    <pic:cNvPr id="1872433678" name=""/>
+                    <pic:cNvPicPr/>
+                  </pic:nvPicPr>
+                  <pic:blipFill>
+                    <a:blip r:embed="rId15"/>
+                    <a:stretch>
+                      <a:fillRect/>
+                    </a:stretch>
+                  </pic:blipFill>
+                  <pic:spPr>
+                    <a:xfrm>
+                      <a:off x="0" y="0"/>
+                      <a:ext cx="5731510" cy="4617720"/>
+                    </a:xfrm>
+                    <a:prstGeom prst="rect">
+                      <a:avLst/>
+                    </a:prstGeom>
+                  </pic:spPr>
+                </pic:pic>
+              </a:graphicData>
+            </a:graphic>
+          </wp:inline>
+        </w:drawing>
+      </w:r>
+    </w:p>
+    <w:p/>
+    <w:p/>
+    <w:p>
+      <w:r>
+        <w:drawing>
+          <wp:inline distT="0" distB="0" distL="0" distR="0" wp14:anchorId="7345A564" wp14:editId="279F9D7B">
+            <wp:extent cx="5731510" cy="3334385"/>
+            <wp:effectExtent l="0" t="0" r="2540" b="0"/>
+            <wp:docPr id="1997358337" name="Picture 1"/>
+            <wp:cNvGraphicFramePr>
+              <a:graphicFrameLocks xmlns:a="http://schemas.openxmlformats.org/drawingml/2006/main" noChangeAspect="1"/>
+            </wp:cNvGraphicFramePr>
+            <a:graphic xmlns:a="http://schemas.openxmlformats.org/drawingml/2006/main">
+              <a:graphicData uri="http://schemas.openxmlformats.org/drawingml/2006/picture">
+                <pic:pic xmlns:pic="http://schemas.openxmlformats.org/drawingml/2006/picture">
+                  <pic:nvPicPr>
+                    <pic:cNvPr id="1997358337" name=""/>
+                    <pic:cNvPicPr/>
+                  </pic:nvPicPr>
+                  <pic:blipFill>
+                    <a:blip r:embed="rId16"/>
+                    <a:stretch>
+                      <a:fillRect/>
+                    </a:stretch>
+                  </pic:blipFill>
+                  <pic:spPr>
+                    <a:xfrm>
+                      <a:off x="0" y="0"/>
+                      <a:ext cx="5731510" cy="3334385"/>
                     </a:xfrm>
                     <a:prstGeom prst="rect">
                       <a:avLst/>

</xml_diff>

<commit_message>
cleaned up css, removed some duplicate lines
</commit_message>
<xml_diff>
--- a/Documentation/processdiaryimagecollection.docx
+++ b/Documentation/processdiaryimagecollection.docx
@@ -474,6 +474,9 @@
     <w:p/>
     <w:p>
       <w:r>
+        <w:rPr>
+          <w:noProof/>
+        </w:rPr>
         <w:drawing>
           <wp:inline distT="0" distB="0" distL="0" distR="0" wp14:anchorId="7345A564" wp14:editId="279F9D7B">
             <wp:extent cx="5731510" cy="3334385"/>
@@ -499,6 +502,286 @@
                     <a:xfrm>
                       <a:off x="0" y="0"/>
                       <a:ext cx="5731510" cy="3334385"/>
+                    </a:xfrm>
+                    <a:prstGeom prst="rect">
+                      <a:avLst/>
+                    </a:prstGeom>
+                  </pic:spPr>
+                </pic:pic>
+              </a:graphicData>
+            </a:graphic>
+          </wp:inline>
+        </w:drawing>
+      </w:r>
+    </w:p>
+    <w:p>
+      <w:r>
+        <w:lastRenderedPageBreak/>
+        <w:drawing>
+          <wp:anchor distT="0" distB="0" distL="114300" distR="114300" simplePos="0" relativeHeight="251658240" behindDoc="0" locked="0" layoutInCell="1" allowOverlap="1" wp14:anchorId="46416D90" wp14:editId="40F474C4">
+            <wp:simplePos x="914400" y="914400"/>
+            <wp:positionH relativeFrom="column">
+              <wp:align>left</wp:align>
+            </wp:positionH>
+            <wp:positionV relativeFrom="paragraph">
+              <wp:align>top</wp:align>
+            </wp:positionV>
+            <wp:extent cx="5731510" cy="2265680"/>
+            <wp:effectExtent l="0" t="0" r="2540" b="1270"/>
+            <wp:wrapSquare wrapText="bothSides"/>
+            <wp:docPr id="713107359" name="Picture 1"/>
+            <wp:cNvGraphicFramePr>
+              <a:graphicFrameLocks xmlns:a="http://schemas.openxmlformats.org/drawingml/2006/main" noChangeAspect="1"/>
+            </wp:cNvGraphicFramePr>
+            <a:graphic xmlns:a="http://schemas.openxmlformats.org/drawingml/2006/main">
+              <a:graphicData uri="http://schemas.openxmlformats.org/drawingml/2006/picture">
+                <pic:pic xmlns:pic="http://schemas.openxmlformats.org/drawingml/2006/picture">
+                  <pic:nvPicPr>
+                    <pic:cNvPr id="713107359" name=""/>
+                    <pic:cNvPicPr/>
+                  </pic:nvPicPr>
+                  <pic:blipFill>
+                    <a:blip r:embed="rId17" cstate="print">
+                      <a:extLst>
+                        <a:ext uri="{28A0092B-C50C-407E-A947-70E740481C1C}">
+                          <a14:useLocalDpi xmlns:a14="http://schemas.microsoft.com/office/drawing/2010/main" val="0"/>
+                        </a:ext>
+                      </a:extLst>
+                    </a:blip>
+                    <a:stretch>
+                      <a:fillRect/>
+                    </a:stretch>
+                  </pic:blipFill>
+                  <pic:spPr>
+                    <a:xfrm>
+                      <a:off x="0" y="0"/>
+                      <a:ext cx="5731510" cy="2265680"/>
+                    </a:xfrm>
+                    <a:prstGeom prst="rect">
+                      <a:avLst/>
+                    </a:prstGeom>
+                  </pic:spPr>
+                </pic:pic>
+              </a:graphicData>
+            </a:graphic>
+          </wp:anchor>
+        </w:drawing>
+      </w:r>
+      <w:r>
+        <w:br w:type="textWrapping" w:clear="all"/>
+      </w:r>
+      <w:r>
+        <w:drawing>
+          <wp:inline distT="0" distB="0" distL="0" distR="0" wp14:anchorId="7AF3C1BF" wp14:editId="1C89C69D">
+            <wp:extent cx="5731510" cy="3109595"/>
+            <wp:effectExtent l="0" t="0" r="2540" b="0"/>
+            <wp:docPr id="1406258429" name="Picture 1"/>
+            <wp:cNvGraphicFramePr>
+              <a:graphicFrameLocks xmlns:a="http://schemas.openxmlformats.org/drawingml/2006/main" noChangeAspect="1"/>
+            </wp:cNvGraphicFramePr>
+            <a:graphic xmlns:a="http://schemas.openxmlformats.org/drawingml/2006/main">
+              <a:graphicData uri="http://schemas.openxmlformats.org/drawingml/2006/picture">
+                <pic:pic xmlns:pic="http://schemas.openxmlformats.org/drawingml/2006/picture">
+                  <pic:nvPicPr>
+                    <pic:cNvPr id="1406258429" name=""/>
+                    <pic:cNvPicPr/>
+                  </pic:nvPicPr>
+                  <pic:blipFill>
+                    <a:blip r:embed="rId18"/>
+                    <a:stretch>
+                      <a:fillRect/>
+                    </a:stretch>
+                  </pic:blipFill>
+                  <pic:spPr>
+                    <a:xfrm>
+                      <a:off x="0" y="0"/>
+                      <a:ext cx="5731510" cy="3109595"/>
+                    </a:xfrm>
+                    <a:prstGeom prst="rect">
+                      <a:avLst/>
+                    </a:prstGeom>
+                  </pic:spPr>
+                </pic:pic>
+              </a:graphicData>
+            </a:graphic>
+          </wp:inline>
+        </w:drawing>
+      </w:r>
+    </w:p>
+    <w:p/>
+    <w:p>
+      <w:r>
+        <w:lastRenderedPageBreak/>
+        <w:drawing>
+          <wp:inline distT="0" distB="0" distL="0" distR="0" wp14:anchorId="09CE2CA0" wp14:editId="7C91E84A">
+            <wp:extent cx="5731510" cy="3060065"/>
+            <wp:effectExtent l="0" t="0" r="2540" b="6985"/>
+            <wp:docPr id="1579687063" name="Picture 1"/>
+            <wp:cNvGraphicFramePr>
+              <a:graphicFrameLocks xmlns:a="http://schemas.openxmlformats.org/drawingml/2006/main" noChangeAspect="1"/>
+            </wp:cNvGraphicFramePr>
+            <a:graphic xmlns:a="http://schemas.openxmlformats.org/drawingml/2006/main">
+              <a:graphicData uri="http://schemas.openxmlformats.org/drawingml/2006/picture">
+                <pic:pic xmlns:pic="http://schemas.openxmlformats.org/drawingml/2006/picture">
+                  <pic:nvPicPr>
+                    <pic:cNvPr id="1579687063" name=""/>
+                    <pic:cNvPicPr/>
+                  </pic:nvPicPr>
+                  <pic:blipFill>
+                    <a:blip r:embed="rId19"/>
+                    <a:stretch>
+                      <a:fillRect/>
+                    </a:stretch>
+                  </pic:blipFill>
+                  <pic:spPr>
+                    <a:xfrm>
+                      <a:off x="0" y="0"/>
+                      <a:ext cx="5731510" cy="3060065"/>
+                    </a:xfrm>
+                    <a:prstGeom prst="rect">
+                      <a:avLst/>
+                    </a:prstGeom>
+                  </pic:spPr>
+                </pic:pic>
+              </a:graphicData>
+            </a:graphic>
+          </wp:inline>
+        </w:drawing>
+      </w:r>
+    </w:p>
+    <w:p>
+      <w:r>
+        <w:rPr>
+          <w:noProof/>
+        </w:rPr>
+        <w:drawing>
+          <wp:inline distT="0" distB="0" distL="0" distR="0" wp14:anchorId="243B5EB2" wp14:editId="64AC4D10">
+            <wp:extent cx="5731510" cy="3146425"/>
+            <wp:effectExtent l="0" t="0" r="2540" b="0"/>
+            <wp:docPr id="1891686611" name="Picture 4"/>
+            <wp:cNvGraphicFramePr>
+              <a:graphicFrameLocks xmlns:a="http://schemas.openxmlformats.org/drawingml/2006/main" noChangeAspect="1"/>
+            </wp:cNvGraphicFramePr>
+            <a:graphic xmlns:a="http://schemas.openxmlformats.org/drawingml/2006/main">
+              <a:graphicData uri="http://schemas.openxmlformats.org/drawingml/2006/picture">
+                <pic:pic xmlns:pic="http://schemas.openxmlformats.org/drawingml/2006/picture">
+                  <pic:nvPicPr>
+                    <pic:cNvPr id="1891686611" name="Picture 1891686611"/>
+                    <pic:cNvPicPr/>
+                  </pic:nvPicPr>
+                  <pic:blipFill>
+                    <a:blip r:embed="rId20" cstate="print">
+                      <a:extLst>
+                        <a:ext uri="{28A0092B-C50C-407E-A947-70E740481C1C}">
+                          <a14:useLocalDpi xmlns:a14="http://schemas.microsoft.com/office/drawing/2010/main" val="0"/>
+                        </a:ext>
+                      </a:extLst>
+                    </a:blip>
+                    <a:stretch>
+                      <a:fillRect/>
+                    </a:stretch>
+                  </pic:blipFill>
+                  <pic:spPr>
+                    <a:xfrm>
+                      <a:off x="0" y="0"/>
+                      <a:ext cx="5731510" cy="3146425"/>
+                    </a:xfrm>
+                    <a:prstGeom prst="rect">
+                      <a:avLst/>
+                    </a:prstGeom>
+                  </pic:spPr>
+                </pic:pic>
+              </a:graphicData>
+            </a:graphic>
+          </wp:inline>
+        </w:drawing>
+      </w:r>
+    </w:p>
+    <w:p>
+      <w:r>
+        <w:rPr>
+          <w:noProof/>
+        </w:rPr>
+        <w:lastRenderedPageBreak/>
+        <w:drawing>
+          <wp:inline distT="0" distB="0" distL="0" distR="0" wp14:anchorId="009F74F2" wp14:editId="74250D69">
+            <wp:extent cx="5731510" cy="3607435"/>
+            <wp:effectExtent l="0" t="0" r="2540" b="0"/>
+            <wp:docPr id="13633213" name="Picture 5"/>
+            <wp:cNvGraphicFramePr>
+              <a:graphicFrameLocks xmlns:a="http://schemas.openxmlformats.org/drawingml/2006/main" noChangeAspect="1"/>
+            </wp:cNvGraphicFramePr>
+            <a:graphic xmlns:a="http://schemas.openxmlformats.org/drawingml/2006/main">
+              <a:graphicData uri="http://schemas.openxmlformats.org/drawingml/2006/picture">
+                <pic:pic xmlns:pic="http://schemas.openxmlformats.org/drawingml/2006/picture">
+                  <pic:nvPicPr>
+                    <pic:cNvPr id="13633213" name="Picture 13633213"/>
+                    <pic:cNvPicPr/>
+                  </pic:nvPicPr>
+                  <pic:blipFill>
+                    <a:blip r:embed="rId21">
+                      <a:extLst>
+                        <a:ext uri="{28A0092B-C50C-407E-A947-70E740481C1C}">
+                          <a14:useLocalDpi xmlns:a14="http://schemas.microsoft.com/office/drawing/2010/main" val="0"/>
+                        </a:ext>
+                      </a:extLst>
+                    </a:blip>
+                    <a:stretch>
+                      <a:fillRect/>
+                    </a:stretch>
+                  </pic:blipFill>
+                  <pic:spPr>
+                    <a:xfrm>
+                      <a:off x="0" y="0"/>
+                      <a:ext cx="5731510" cy="3607435"/>
+                    </a:xfrm>
+                    <a:prstGeom prst="rect">
+                      <a:avLst/>
+                    </a:prstGeom>
+                  </pic:spPr>
+                </pic:pic>
+              </a:graphicData>
+            </a:graphic>
+          </wp:inline>
+        </w:drawing>
+      </w:r>
+    </w:p>
+    <w:p>
+      <w:r>
+        <w:rPr>
+          <w:noProof/>
+        </w:rPr>
+        <w:drawing>
+          <wp:inline distT="0" distB="0" distL="0" distR="0" wp14:anchorId="43CAC4ED" wp14:editId="5DE19D71">
+            <wp:extent cx="5731510" cy="1158875"/>
+            <wp:effectExtent l="0" t="0" r="2540" b="3175"/>
+            <wp:docPr id="259160085" name="Picture 6"/>
+            <wp:cNvGraphicFramePr>
+              <a:graphicFrameLocks xmlns:a="http://schemas.openxmlformats.org/drawingml/2006/main" noChangeAspect="1"/>
+            </wp:cNvGraphicFramePr>
+            <a:graphic xmlns:a="http://schemas.openxmlformats.org/drawingml/2006/main">
+              <a:graphicData uri="http://schemas.openxmlformats.org/drawingml/2006/picture">
+                <pic:pic xmlns:pic="http://schemas.openxmlformats.org/drawingml/2006/picture">
+                  <pic:nvPicPr>
+                    <pic:cNvPr id="259160085" name="Picture 259160085"/>
+                    <pic:cNvPicPr/>
+                  </pic:nvPicPr>
+                  <pic:blipFill>
+                    <a:blip r:embed="rId22" cstate="print">
+                      <a:extLst>
+                        <a:ext uri="{28A0092B-C50C-407E-A947-70E740481C1C}">
+                          <a14:useLocalDpi xmlns:a14="http://schemas.microsoft.com/office/drawing/2010/main" val="0"/>
+                        </a:ext>
+                      </a:extLst>
+                    </a:blip>
+                    <a:stretch>
+                      <a:fillRect/>
+                    </a:stretch>
+                  </pic:blipFill>
+                  <pic:spPr>
+                    <a:xfrm>
+                      <a:off x="0" y="0"/>
+                      <a:ext cx="5731510" cy="1158875"/>
                     </a:xfrm>
                     <a:prstGeom prst="rect">
                       <a:avLst/>

</xml_diff>

<commit_message>
fixed nrl standings to be updated
</commit_message>
<xml_diff>
--- a/Documentation/processdiaryimagecollection.docx
+++ b/Documentation/processdiaryimagecollection.docx
@@ -786,6 +786,173 @@
                     <a:prstGeom prst="rect">
                       <a:avLst/>
                     </a:prstGeom>
+                  </pic:spPr>
+                </pic:pic>
+              </a:graphicData>
+            </a:graphic>
+          </wp:inline>
+        </w:drawing>
+      </w:r>
+    </w:p>
+    <w:p/>
+    <w:p/>
+    <w:p/>
+    <w:p>
+      <w:r>
+        <w:rPr>
+          <w:noProof/>
+        </w:rPr>
+        <w:lastRenderedPageBreak/>
+        <w:drawing>
+          <wp:inline distT="0" distB="0" distL="0" distR="0" wp14:anchorId="1169E386" wp14:editId="427C900F">
+            <wp:extent cx="5727700" cy="7835900"/>
+            <wp:effectExtent l="0" t="0" r="6350" b="0"/>
+            <wp:docPr id="1102410063" name="Picture 8"/>
+            <wp:cNvGraphicFramePr>
+              <a:graphicFrameLocks xmlns:a="http://schemas.openxmlformats.org/drawingml/2006/main" noChangeAspect="1"/>
+            </wp:cNvGraphicFramePr>
+            <a:graphic xmlns:a="http://schemas.openxmlformats.org/drawingml/2006/main">
+              <a:graphicData uri="http://schemas.openxmlformats.org/drawingml/2006/picture">
+                <pic:pic xmlns:pic="http://schemas.openxmlformats.org/drawingml/2006/picture">
+                  <pic:nvPicPr>
+                    <pic:cNvPr id="0" name="Picture 10"/>
+                    <pic:cNvPicPr>
+                      <a:picLocks noChangeAspect="1" noChangeArrowheads="1"/>
+                    </pic:cNvPicPr>
+                  </pic:nvPicPr>
+                  <pic:blipFill>
+                    <a:blip r:embed="rId23">
+                      <a:extLst>
+                        <a:ext uri="{28A0092B-C50C-407E-A947-70E740481C1C}">
+                          <a14:useLocalDpi xmlns:a14="http://schemas.microsoft.com/office/drawing/2010/main" val="0"/>
+                        </a:ext>
+                      </a:extLst>
+                    </a:blip>
+                    <a:srcRect/>
+                    <a:stretch>
+                      <a:fillRect/>
+                    </a:stretch>
+                  </pic:blipFill>
+                  <pic:spPr bwMode="auto">
+                    <a:xfrm>
+                      <a:off x="0" y="0"/>
+                      <a:ext cx="5727700" cy="7835900"/>
+                    </a:xfrm>
+                    <a:prstGeom prst="rect">
+                      <a:avLst/>
+                    </a:prstGeom>
+                    <a:noFill/>
+                    <a:ln>
+                      <a:noFill/>
+                    </a:ln>
+                  </pic:spPr>
+                </pic:pic>
+              </a:graphicData>
+            </a:graphic>
+          </wp:inline>
+        </w:drawing>
+      </w:r>
+      <w:r>
+        <w:rPr>
+          <w:noProof/>
+        </w:rPr>
+        <w:lastRenderedPageBreak/>
+        <w:drawing>
+          <wp:inline distT="0" distB="0" distL="0" distR="0" wp14:anchorId="010A10B2" wp14:editId="41761D41">
+            <wp:extent cx="5727700" cy="3810000"/>
+            <wp:effectExtent l="0" t="0" r="6350" b="0"/>
+            <wp:docPr id="1535490680" name="Picture 2"/>
+            <wp:cNvGraphicFramePr>
+              <a:graphicFrameLocks xmlns:a="http://schemas.openxmlformats.org/drawingml/2006/main" noChangeAspect="1"/>
+            </wp:cNvGraphicFramePr>
+            <a:graphic xmlns:a="http://schemas.openxmlformats.org/drawingml/2006/main">
+              <a:graphicData uri="http://schemas.openxmlformats.org/drawingml/2006/picture">
+                <pic:pic xmlns:pic="http://schemas.openxmlformats.org/drawingml/2006/picture">
+                  <pic:nvPicPr>
+                    <pic:cNvPr id="0" name="Picture 3"/>
+                    <pic:cNvPicPr>
+                      <a:picLocks noChangeAspect="1" noChangeArrowheads="1"/>
+                    </pic:cNvPicPr>
+                  </pic:nvPicPr>
+                  <pic:blipFill>
+                    <a:blip r:embed="rId24" cstate="print">
+                      <a:extLst>
+                        <a:ext uri="{28A0092B-C50C-407E-A947-70E740481C1C}">
+                          <a14:useLocalDpi xmlns:a14="http://schemas.microsoft.com/office/drawing/2010/main" val="0"/>
+                        </a:ext>
+                      </a:extLst>
+                    </a:blip>
+                    <a:srcRect/>
+                    <a:stretch>
+                      <a:fillRect/>
+                    </a:stretch>
+                  </pic:blipFill>
+                  <pic:spPr bwMode="auto">
+                    <a:xfrm>
+                      <a:off x="0" y="0"/>
+                      <a:ext cx="5727700" cy="3810000"/>
+                    </a:xfrm>
+                    <a:prstGeom prst="rect">
+                      <a:avLst/>
+                    </a:prstGeom>
+                    <a:noFill/>
+                    <a:ln>
+                      <a:noFill/>
+                    </a:ln>
+                  </pic:spPr>
+                </pic:pic>
+              </a:graphicData>
+            </a:graphic>
+          </wp:inline>
+        </w:drawing>
+      </w:r>
+      <w:r>
+        <w:rPr>
+          <w:noProof/>
+        </w:rPr>
+        <w:lastRenderedPageBreak/>
+        <w:drawing>
+          <wp:inline distT="0" distB="0" distL="0" distR="0" wp14:anchorId="6610AAAA" wp14:editId="2A2D5071">
+            <wp:extent cx="5734050" cy="6451600"/>
+            <wp:effectExtent l="0" t="0" r="0" b="6350"/>
+            <wp:docPr id="1112020185" name="Picture 7"/>
+            <wp:cNvGraphicFramePr>
+              <a:graphicFrameLocks xmlns:a="http://schemas.openxmlformats.org/drawingml/2006/main" noChangeAspect="1"/>
+            </wp:cNvGraphicFramePr>
+            <a:graphic xmlns:a="http://schemas.openxmlformats.org/drawingml/2006/main">
+              <a:graphicData uri="http://schemas.openxmlformats.org/drawingml/2006/picture">
+                <pic:pic xmlns:pic="http://schemas.openxmlformats.org/drawingml/2006/picture">
+                  <pic:nvPicPr>
+                    <pic:cNvPr id="0" name="Picture 9"/>
+                    <pic:cNvPicPr>
+                      <a:picLocks noChangeAspect="1" noChangeArrowheads="1"/>
+                    </pic:cNvPicPr>
+                  </pic:nvPicPr>
+                  <pic:blipFill>
+                    <a:blip r:embed="rId25">
+                      <a:extLst>
+                        <a:ext uri="{28A0092B-C50C-407E-A947-70E740481C1C}">
+                          <a14:useLocalDpi xmlns:a14="http://schemas.microsoft.com/office/drawing/2010/main" val="0"/>
+                        </a:ext>
+                      </a:extLst>
+                    </a:blip>
+                    <a:srcRect/>
+                    <a:stretch>
+                      <a:fillRect/>
+                    </a:stretch>
+                  </pic:blipFill>
+                  <pic:spPr bwMode="auto">
+                    <a:xfrm>
+                      <a:off x="0" y="0"/>
+                      <a:ext cx="5734050" cy="6451600"/>
+                    </a:xfrm>
+                    <a:prstGeom prst="rect">
+                      <a:avLst/>
+                    </a:prstGeom>
+                    <a:noFill/>
+                    <a:ln>
+                      <a:noFill/>
+                    </a:ln>
                   </pic:spPr>
                 </pic:pic>
               </a:graphicData>

</xml_diff>